<commit_message>
docs: sync manual updates to research paper
</commit_message>
<xml_diff>
--- a/LeJEPA_Fake_Currency_Detection_Research.docx
+++ b/LeJEPA_Fake_Currency_Detection_Research.docx
@@ -13,7 +13,41 @@
           <w:b/>
           <w:sz w:val="48"/>
         </w:rPr>
-        <w:t>LeJEPA: Fake Indian Currency Detection Using Sketched Isotropic Gaussian Regularization in Joint-Embedding Predictive Architectures</w:t>
+        <w:t>Fake Indian Currency Detection Using Sketched Isotropic Gaussian Regularization in Joint-Embedding Predictive Architectures</w:t>
+      </w:r>
+      <w:r>
+        <w:rPr>
+          <w:rFonts w:ascii="Times New Roman" w:hAnsi="Times New Roman"/>
+          <w:b/>
+          <w:sz w:val="48"/>
+        </w:rPr>
+        <w:t xml:space="preserve"> </w:t>
+      </w:r>
+      <w:bookmarkStart w:id="0" w:name="_GoBack"/>
+      <w:bookmarkEnd w:id="0"/>
+      <w:r>
+        <w:rPr>
+          <w:rFonts w:ascii="Times New Roman" w:hAnsi="Times New Roman"/>
+          <w:b/>
+          <w:sz w:val="48"/>
+        </w:rPr>
+        <w:t>(</w:t>
+      </w:r>
+      <w:r>
+        <w:rPr>
+          <w:rFonts w:ascii="Times New Roman" w:hAnsi="Times New Roman"/>
+          <w:b/>
+          <w:sz w:val="48"/>
+        </w:rPr>
+        <w:t>LeJEPA</w:t>
+      </w:r>
+      <w:r>
+        <w:rPr>
+          <w:rFonts w:ascii="Times New Roman" w:hAnsi="Times New Roman"/>
+          <w:b/>
+          <w:sz w:val="48"/>
+        </w:rPr>
+        <w:t>)</w:t>
       </w:r>
     </w:p>
     <w:p>
@@ -21,11 +55,13 @@
         <w:spacing w:after="40"/>
         <w:jc w:val="center"/>
       </w:pPr>
+      <w:proofErr w:type="spellStart"/>
       <w:r>
-        <w:rPr>
-          <w:rFonts w:ascii="Times New Roman" w:hAnsi="Times New Roman"/>
-        </w:rPr>
-        <w:t>First Author</w:t>
+        <w:t>Kajol</w:t>
+      </w:r>
+      <w:proofErr w:type="spellEnd"/>
+      <w:r>
+        <w:t xml:space="preserve"> Kadam</w:t>
       </w:r>
     </w:p>
     <w:p>
@@ -38,7 +74,14 @@
           <w:rFonts w:ascii="Times New Roman" w:hAnsi="Times New Roman"/>
           <w:sz w:val="18"/>
         </w:rPr>
-        <w:t>Department of Computer Science and Engineering</w:t>
+        <w:t xml:space="preserve">Department of </w:t>
+      </w:r>
+      <w:r>
+        <w:rPr>
+          <w:rFonts w:ascii="Times New Roman" w:hAnsi="Times New Roman"/>
+          <w:sz w:val="18"/>
+        </w:rPr>
+        <w:t>Electronics &amp; Telecommunication</w:t>
       </w:r>
       <w:r>
         <w:rPr>
@@ -46,7 +89,38 @@
           <w:sz w:val="18"/>
         </w:rPr>
         <w:br/>
-        <w:t>University Name, City, Country</w:t>
+      </w:r>
+      <w:proofErr w:type="spellStart"/>
+      <w:r>
+        <w:rPr>
+          <w:rFonts w:ascii="Times New Roman" w:hAnsi="Times New Roman"/>
+          <w:sz w:val="18"/>
+        </w:rPr>
+        <w:t>Savitribai</w:t>
+      </w:r>
+      <w:proofErr w:type="spellEnd"/>
+      <w:r>
+        <w:rPr>
+          <w:rFonts w:ascii="Times New Roman" w:hAnsi="Times New Roman"/>
+          <w:sz w:val="18"/>
+        </w:rPr>
+        <w:t xml:space="preserve"> </w:t>
+      </w:r>
+      <w:proofErr w:type="spellStart"/>
+      <w:r>
+        <w:rPr>
+          <w:rFonts w:ascii="Times New Roman" w:hAnsi="Times New Roman"/>
+          <w:sz w:val="18"/>
+        </w:rPr>
+        <w:t>Phule</w:t>
+      </w:r>
+      <w:proofErr w:type="spellEnd"/>
+      <w:r>
+        <w:rPr>
+          <w:rFonts w:ascii="Times New Roman" w:hAnsi="Times New Roman"/>
+          <w:sz w:val="18"/>
+        </w:rPr>
+        <w:t xml:space="preserve"> Pune University</w:t>
       </w:r>
       <w:r>
         <w:rPr>
@@ -54,7 +128,9 @@
           <w:sz w:val="18"/>
         </w:rPr>
         <w:br/>
-        <w:t>email@university.edu</w:t>
+      </w:r>
+      <w:r>
+        <w:t>Kakjscoe@gmail.com</w:t>
       </w:r>
     </w:p>
     <w:p>
@@ -77,55 +153,7 @@
           <w:i/>
           <w:sz w:val="18"/>
         </w:rPr>
-        <w:t xml:space="preserve">Counterfeit currency remains a persistent challenge to financial systems worldwide, particularly in cash-dominant economies such as India. Traditional detection methods rely on hand-crafted Computer Vision (CV) heuristics or fully-supervised Convolutional </w:t>
-      </w:r>
-      <w:r>
-        <w:rPr>
-          <w:rFonts w:ascii="Times New Roman" w:hAnsi="Times New Roman"/>
-          <w:i/>
-          <w:sz w:val="18"/>
-        </w:rPr>
-        <w:t>Neural Networks (CNNs), both of which suffer from limited generalizability and expensive labeling requirements. This paper presents a novel application of the recently proposed LeJEPA (Joint-Embedding Predictive Architecture with Sketched Isotropic Gaussia</w:t>
-      </w:r>
-      <w:r>
-        <w:rPr>
-          <w:rFonts w:ascii="Times New Roman" w:hAnsi="Times New Roman"/>
-          <w:i/>
-          <w:sz w:val="18"/>
-        </w:rPr>
-        <w:t>n Regularization) framework for automated fake Indian currency detection. Unlike standard JEPA variants that depend on brittle Exponential Moving Average (EMA) teacher networks, LeJEPA employs SIGReg — a mathematically principled regularization strategy th</w:t>
-      </w:r>
-      <w:r>
-        <w:rPr>
-          <w:rFonts w:ascii="Times New Roman" w:hAnsi="Times New Roman"/>
-          <w:i/>
-          <w:sz w:val="18"/>
-        </w:rPr>
-        <w:t>at enforces isotropic Gaussian structure on latent embeddings via random projection and quantile-quantile matching. We implement a full-stack detection system comprising a ViT-Tiny encoder backbone, six complementary CV feature analyzers (watermark SSIM, s</w:t>
-      </w:r>
-      <w:r>
-        <w:rPr>
-          <w:rFonts w:ascii="Times New Roman" w:hAnsi="Times New Roman"/>
-          <w:i/>
-          <w:sz w:val="18"/>
-        </w:rPr>
-        <w:t>ecurity thread detection, GLCM texture profiling, color histogram analysis, OCR serial validation, and dimensional verification), and a FastAPI-based inference pipeline. Experimental evaluation on a dataset of 7,445 Indian currency images across seven deno</w:t>
-      </w:r>
-      <w:r>
-        <w:rPr>
-          <w:rFonts w:ascii="Times New Roman" w:hAnsi="Times New Roman"/>
-          <w:i/>
-          <w:sz w:val="18"/>
-        </w:rPr>
-        <w:t>minations demonstrates that even with a single pretraining epoch on CPU hardware, LeJEPA achieves 86.48% precision in counterfeit identification, validating the effectiveness of collapse-free self-supervised representations for security-critical visual ins</w:t>
-      </w:r>
-      <w:r>
-        <w:rPr>
-          <w:rFonts w:ascii="Times New Roman" w:hAnsi="Times New Roman"/>
-          <w:i/>
-          <w:sz w:val="18"/>
-        </w:rPr>
-        <w:t>pection tasks.</w:t>
+        <w:t>Counterfeit currency remains a persistent challenge to financial systems worldwide, particularly in cash-dominant economies such as India. Traditional detection methods rely on hand-crafted Computer Vision (CV) heuristics or fully-supervised Convolutional Neural Networks (CNNs), both of which suffer from limited generalizability and expensive labeling requirements. This paper presents a novel application of the recently proposed LeJEPA (Joint-Embedding Predictive Architecture with Sketched Isotropic Gaussian Regularization) framework for automated fake Indian currency detection. Unlike standard JEPA variants that depend on brittle Exponential Moving Average (EMA) teacher networks, LeJEPA employs SIGReg — a mathematically principled regularization strategy that enforces isotropic Gaussian structure on latent embeddings via random projection and quantile-quantile matching. We implement a full-stack detection system comprising a ViT-Tiny encoder backbone, six complementary CV feature analyzers (watermark SSIM, security thread detection, GLCM texture profiling, color histogram analysis, OCR serial validation, and dimensional verification), and a FastAPI-based inference pipeline. Experimental evaluation on a dataset of 7,445 Indian currency images across seven denominations demonstrates that even with a single pretraining epoch on CPU hardware, LeJEPA achieves 86.48% precision in counterfeit identification, validating the effectiveness of collapse-free self-supervised representations for security-critical visual inspection tasks.</w:t>
       </w:r>
     </w:p>
     <w:p>
@@ -187,77 +215,35 @@
           <w:rFonts w:ascii="Times New Roman" w:hAnsi="Times New Roman"/>
           <w:sz w:val="20"/>
         </w:rPr>
-        <w:t>The Reserve Bank of India (RBI) reported the detection of approximatel</w:t>
+        <w:t>The Reserve Bank of India (RBI) reported the detection of approximately 2.2 lakh counterfeit notes during the fiscal year 2023-24 alone, representing a 14.4% increase over the previous year [1]. This statistic underscores the growing sophistication of counterfeit operations and the urgent need for automated, scalable detection mechanisms that can be deployed at bank branches, ATMs, and point-of-sale terminals across the country.</w:t>
       </w:r>
+    </w:p>
+    <w:p>
+      <w:pPr>
+        <w:spacing w:after="80"/>
+        <w:ind w:firstLine="357"/>
+        <w:jc w:val="both"/>
+      </w:pPr>
       <w:r>
         <w:rPr>
           <w:rFonts w:ascii="Times New Roman" w:hAnsi="Times New Roman"/>
           <w:sz w:val="20"/>
         </w:rPr>
-        <w:t>y 2.2 lakh counterfeit notes during the fiscal year 2023-24 alone, representing a 14.4% increase over the previous year [1]. This statistic underscores the growing sophistication of counterfeit operations and the urgent need for automated, scalable detecti</w:t>
+        <w:t>Existing automated approaches broadly fall into two categories: (a) deterministic Computer Vision pipelines that extract hand-crafted features such as watermark presence, security thread positioning, and color histograms using classical algorithms like SSIM, GLCM, and template matching; and (b) deep learning classifiers, typically CNNs pre-trained on ImageNet and fine-tuned on currency datasets. While category (a) offers interpretability, it is fragile against high-quality counterfeits that visually replicate security elements. Category (b) achieves superior accuracy but demands large annotated datasets — a resource constraint that is particularly acute in the domain of currency forgery, where genuine counterfeit specimens are restricted by law enforcement access.</w:t>
       </w:r>
+    </w:p>
+    <w:p>
+      <w:pPr>
+        <w:spacing w:after="80"/>
+        <w:ind w:firstLine="357"/>
+        <w:jc w:val="both"/>
+      </w:pPr>
       <w:r>
         <w:rPr>
           <w:rFonts w:ascii="Times New Roman" w:hAnsi="Times New Roman"/>
           <w:sz w:val="20"/>
         </w:rPr>
-        <w:t>on mechanisms that can be deployed at bank branches, ATMs, and point-of-sale terminals across the country.</w:t>
-      </w:r>
-    </w:p>
-    <w:p>
-      <w:pPr>
-        <w:spacing w:after="80"/>
-        <w:ind w:firstLine="357"/>
-        <w:jc w:val="both"/>
-      </w:pPr>
-      <w:r>
-        <w:rPr>
-          <w:rFonts w:ascii="Times New Roman" w:hAnsi="Times New Roman"/>
-          <w:sz w:val="20"/>
-        </w:rPr>
-        <w:t>Existing automated approaches broadly fall into two categories: (a) deterministic Computer Vision pipelines that extract hand-crafted features such a</w:t>
-      </w:r>
-      <w:r>
-        <w:rPr>
-          <w:rFonts w:ascii="Times New Roman" w:hAnsi="Times New Roman"/>
-          <w:sz w:val="20"/>
-        </w:rPr>
-        <w:t xml:space="preserve">s watermark presence, security thread positioning, and color histograms using classical algorithms like SSIM, GLCM, and template matching; and (b) deep learning classifiers, typically CNNs pre-trained on ImageNet and fine-tuned on currency datasets. While </w:t>
-      </w:r>
-      <w:r>
-        <w:rPr>
-          <w:rFonts w:ascii="Times New Roman" w:hAnsi="Times New Roman"/>
-          <w:sz w:val="20"/>
-        </w:rPr>
-        <w:t>category (a) offers interpretability, it is fragile against high-quality counterfeits that visually replicate security elements. Category (b) achieves superior accuracy but demands large annotated datasets — a resource constraint that is particularly acute</w:t>
-      </w:r>
-      <w:r>
-        <w:rPr>
-          <w:rFonts w:ascii="Times New Roman" w:hAnsi="Times New Roman"/>
-          <w:sz w:val="20"/>
-        </w:rPr>
-        <w:t xml:space="preserve"> in the domain of currency forgery, where genuine counterfeit specimens are restricted by law enforcement access.</w:t>
-      </w:r>
-    </w:p>
-    <w:p>
-      <w:pPr>
-        <w:spacing w:after="80"/>
-        <w:ind w:firstLine="357"/>
-        <w:jc w:val="both"/>
-      </w:pPr>
-      <w:r>
-        <w:rPr>
-          <w:rFonts w:ascii="Times New Roman" w:hAnsi="Times New Roman"/>
-          <w:sz w:val="20"/>
-        </w:rPr>
-        <w:t>Self-Supervised Learning (SSL) has emerged as a compelling paradigm to bridge this gap. By learning visual representations from unlabeled data</w:t>
-      </w:r>
-      <w:r>
-        <w:rPr>
-          <w:rFonts w:ascii="Times New Roman" w:hAnsi="Times New Roman"/>
-          <w:sz w:val="20"/>
-        </w:rPr>
-        <w:t xml:space="preserve"> through pretext tasks, SSL methods reduce dependence on manual annotation. </w:t>
+        <w:t xml:space="preserve">Self-Supervised Learning (SSL) has emerged as a compelling paradigm to bridge this gap. By learning visual representations from unlabeled data through pretext tasks, SSL methods reduce dependence on manual annotation. </w:t>
       </w:r>
       <w:r>
         <w:rPr>
@@ -265,49 +251,21 @@
           <w:sz w:val="20"/>
         </w:rPr>
         <w:lastRenderedPageBreak/>
-        <w:t>Among recent SSL architectures, the Joint-Embedding Predictive Architecture (JEPA) proposed by LeCun [2] predicts missing contextual information in embedding space rather than pixe</w:t>
+        <w:t>Among recent SSL architectures, the Joint-Embedding Predictive Architecture (JEPA) proposed by LeCun [2] predicts missing contextual information in embedding space rather than pixel space, enabling the model to capture high-level semantic structure. However, standard JEPA implementations suffer from representation collapse — where all inputs map to trivially identical embeddings — and rely on heuristic solutions such as Exponential Moving Average (EMA) momentum scheduling for the teacher network.</w:t>
       </w:r>
+    </w:p>
+    <w:p>
+      <w:pPr>
+        <w:spacing w:after="80"/>
+        <w:ind w:firstLine="357"/>
+        <w:jc w:val="both"/>
+      </w:pPr>
       <w:r>
         <w:rPr>
           <w:rFonts w:ascii="Times New Roman" w:hAnsi="Times New Roman"/>
           <w:sz w:val="20"/>
         </w:rPr>
-        <w:t xml:space="preserve">l space, enabling the model to capture high-level semantic structure. However, standard JEPA implementations suffer from representation collapse — where all inputs map to trivially identical embeddings — and rely on heuristic solutions such as Exponential </w:t>
-      </w:r>
-      <w:r>
-        <w:rPr>
-          <w:rFonts w:ascii="Times New Roman" w:hAnsi="Times New Roman"/>
-          <w:sz w:val="20"/>
-        </w:rPr>
-        <w:t>Moving Average (EMA) momentum scheduling for the teacher network.</w:t>
-      </w:r>
-    </w:p>
-    <w:p>
-      <w:pPr>
-        <w:spacing w:after="80"/>
-        <w:ind w:firstLine="357"/>
-        <w:jc w:val="both"/>
-      </w:pPr>
-      <w:r>
-        <w:rPr>
-          <w:rFonts w:ascii="Times New Roman" w:hAnsi="Times New Roman"/>
-          <w:sz w:val="20"/>
-        </w:rPr>
-        <w:t>This paper addresses these limitations by deploying LeJEPA [3], a recently proposed variant that replaces EMA-based collapse prevention with Sketched Isotropic Gaussian Regularization (SIGRe</w:t>
-      </w:r>
-      <w:r>
-        <w:rPr>
-          <w:rFonts w:ascii="Times New Roman" w:hAnsi="Times New Roman"/>
-          <w:sz w:val="20"/>
-        </w:rPr>
-        <w:t>g). We present the first application of LeJEPA to the domain of currency authentication and demonstrate that SIGReg's mathematically principled approach to representation stability translates directly into superior classification metrics, particularly prec</w:t>
-      </w:r>
-      <w:r>
-        <w:rPr>
-          <w:rFonts w:ascii="Times New Roman" w:hAnsi="Times New Roman"/>
-          <w:sz w:val="20"/>
-        </w:rPr>
-        <w:t>ision — which is the critical metric for avoiding false acceptance of counterfeit notes.</w:t>
+        <w:t>This paper addresses these limitations by deploying LeJEPA [3], a recently proposed variant that replaces EMA-based collapse prevention with Sketched Isotropic Gaussian Regularization (SIGReg). We present the first application of LeJEPA to the domain of currency authentication and demonstrate that SIGReg's mathematically principled approach to representation stability translates directly into superior classification metrics, particularly precision — which is the critical metric for avoiding false acceptance of counterfeit notes.</w:t>
       </w:r>
     </w:p>
     <w:p>
@@ -348,14 +306,7 @@
           <w:rFonts w:ascii="Times New Roman" w:hAnsi="Times New Roman"/>
           <w:sz w:val="20"/>
         </w:rPr>
-        <w:t>Kumar et al. [4] proposed a multi-stage pipeline combining UV fluorescence analysis with GLCM-based texture features</w:t>
-      </w:r>
-      <w:r>
-        <w:rPr>
-          <w:rFonts w:ascii="Times New Roman" w:hAnsi="Times New Roman"/>
-          <w:sz w:val="20"/>
-        </w:rPr>
-        <w:t xml:space="preserve"> for detecting counterfeit Indian banknotes, achieving 89% accuracy on a controlled dataset. Bhargava and Kaur [5] utilized SIFT-based feature matching against </w:t>
+        <w:t xml:space="preserve">Kumar et al. [4] proposed a multi-stage pipeline combining UV fluorescence analysis with GLCM-based texture features for detecting counterfeit Indian banknotes, achieving 89% accuracy on a controlled dataset. Bhargava </w:t>
       </w:r>
       <w:r>
         <w:rPr>
@@ -363,14 +314,7 @@
           <w:sz w:val="20"/>
         </w:rPr>
         <w:lastRenderedPageBreak/>
-        <w:t>template watermark images, reporting 92% detection rates for ₹500 and ₹2000 denominations. While</w:t>
-      </w:r>
-      <w:r>
-        <w:rPr>
-          <w:rFonts w:ascii="Times New Roman" w:hAnsi="Times New Roman"/>
-          <w:sz w:val="20"/>
-        </w:rPr>
-        <w:t xml:space="preserve"> effective in laboratory conditions, these methods rely on precisely calibrated imaging equipment and predefined templates that cannot generalize to novel counterfeit strategies.</w:t>
+        <w:t>and Kaur [5] utilized SIFT-based feature matching against template watermark images, reporting 92% detection rates for ₹500 and ₹2000 denominations. While effective in laboratory conditions, these methods rely on precisely calibrated imaging equipment and predefined templates that cannot generalize to novel counterfeit strategies.</w:t>
       </w:r>
     </w:p>
     <w:p>
@@ -397,28 +341,7 @@
           <w:rFonts w:ascii="Times New Roman" w:hAnsi="Times New Roman"/>
           <w:sz w:val="20"/>
         </w:rPr>
-        <w:t>Transfer learning with pre-trained CNNs has become th</w:t>
-      </w:r>
-      <w:r>
-        <w:rPr>
-          <w:rFonts w:ascii="Times New Roman" w:hAnsi="Times New Roman"/>
-          <w:sz w:val="20"/>
-        </w:rPr>
-        <w:t>e de facto standard for currency classification. Sarkar et al. [6] fine-tuned ResNet-50 on a dataset of 5,000 Indian currency images, achieving 94.5% accuracy. However, their work required fully supervised labeling of every training sample and exhibited si</w:t>
-      </w:r>
-      <w:r>
-        <w:rPr>
-          <w:rFonts w:ascii="Times New Roman" w:hAnsi="Times New Roman"/>
-          <w:sz w:val="20"/>
-        </w:rPr>
-        <w:t>gnificant performance degradation when tested on denominations absent from the training set. VGG-16 and InceptionV3 architectures have been similarly deployed [7], consistently demonstrating the trade-off between high accuracy on seen distributions and poo</w:t>
-      </w:r>
-      <w:r>
-        <w:rPr>
-          <w:rFonts w:ascii="Times New Roman" w:hAnsi="Times New Roman"/>
-          <w:sz w:val="20"/>
-        </w:rPr>
-        <w:t>r generalization on unseen ones.</w:t>
+        <w:t>Transfer learning with pre-trained CNNs has become the de facto standard for currency classification. Sarkar et al. [6] fine-tuned ResNet-50 on a dataset of 5,000 Indian currency images, achieving 94.5% accuracy. However, their work required fully supervised labeling of every training sample and exhibited significant performance degradation when tested on denominations absent from the training set. VGG-16 and InceptionV3 architectures have been similarly deployed [7], consistently demonstrating the trade-off between high accuracy on seen distributions and poor generalization on unseen ones.</w:t>
       </w:r>
     </w:p>
     <w:p>
@@ -445,28 +368,7 @@
           <w:rFonts w:ascii="Times New Roman" w:hAnsi="Times New Roman"/>
           <w:sz w:val="20"/>
         </w:rPr>
-        <w:t>The SSL paradigm addresses the labeling bottleneck by leveraging pretext tasks on unlabeled data. Masked Autoencoders (MAE) [8] reconstruct masked pixel patches, learning useful visual rep</w:t>
-      </w:r>
-      <w:r>
-        <w:rPr>
-          <w:rFonts w:ascii="Times New Roman" w:hAnsi="Times New Roman"/>
-          <w:sz w:val="20"/>
-        </w:rPr>
-        <w:t xml:space="preserve">resentations in the process. However, MAE operates in pixel space, which forces the model to dedicate significant capacity to low-level texture reconstruction rather than high-level semantic understanding. The JEPA framework [2] resolves this by operating </w:t>
-      </w:r>
-      <w:r>
-        <w:rPr>
-          <w:rFonts w:ascii="Times New Roman" w:hAnsi="Times New Roman"/>
-          <w:sz w:val="20"/>
-        </w:rPr>
-        <w:t>entirely in embedding space: the model predicts the representation of masked patches from visible context patches, learning abstract semantic features. Despite its theoretical elegance, JEPA's reliance on an EMA-driven teacher network introduces architectu</w:t>
-      </w:r>
-      <w:r>
-        <w:rPr>
-          <w:rFonts w:ascii="Times New Roman" w:hAnsi="Times New Roman"/>
-          <w:sz w:val="20"/>
-        </w:rPr>
-        <w:t>ral complexity and tuning fragility, particularly on small datasets. LeJEPA [3] eliminates this dependency through SIGReg, which we detail in Section III.</w:t>
+        <w:t>The SSL paradigm addresses the labeling bottleneck by leveraging pretext tasks on unlabeled data. Masked Autoencoders (MAE) [8] reconstruct masked pixel patches, learning useful visual representations in the process. However, MAE operates in pixel space, which forces the model to dedicate significant capacity to low-level texture reconstruction rather than high-level semantic understanding. The JEPA framework [2] resolves this by operating entirely in embedding space: the model predicts the representation of masked patches from visible context patches, learning abstract semantic features. Despite its theoretical elegance, JEPA's reliance on an EMA-driven teacher network introduces architectural complexity and tuning fragility, particularly on small datasets. LeJEPA [3] eliminates this dependency through SIGReg, which we detail in Section III.</w:t>
       </w:r>
     </w:p>
     <w:p>
@@ -494,21 +396,7 @@
           <w:rFonts w:ascii="Times New Roman" w:hAnsi="Times New Roman"/>
           <w:sz w:val="20"/>
         </w:rPr>
-        <w:t>Our system integrates two complementary detection modalities: (1) a LeJEPA-</w:t>
-      </w:r>
-      <w:r>
-        <w:rPr>
-          <w:rFonts w:ascii="Times New Roman" w:hAnsi="Times New Roman"/>
-          <w:sz w:val="20"/>
-        </w:rPr>
-        <w:t>based deep representation learner that captures semantic currency features via self-supervised pretraining, and (2) six traditional CV analyzers that extract interpretable physical security features. An ensemble scoring mechanism combines both modalities t</w:t>
-      </w:r>
-      <w:r>
-        <w:rPr>
-          <w:rFonts w:ascii="Times New Roman" w:hAnsi="Times New Roman"/>
-          <w:sz w:val="20"/>
-        </w:rPr>
-        <w:t>o produce a final authenticity verdict.</w:t>
+        <w:t>Our system integrates two complementary detection modalities: (1) a LeJEPA-based deep representation learner that captures semantic currency features via self-supervised pretraining, and (2) six traditional CV analyzers that extract interpretable physical security features. An ensemble scoring mechanism combines both modalities to produce a final authenticity verdict.</w:t>
       </w:r>
     </w:p>
     <w:p>
@@ -591,21 +479,7 @@
           <w:rFonts w:ascii="Times New Roman" w:hAnsi="Times New Roman"/>
           <w:sz w:val="20"/>
         </w:rPr>
-        <w:t xml:space="preserve">We adopt the ViT-Tiny configuration as our backbone encoder, consisting of 12 </w:t>
-      </w:r>
-      <w:r>
-        <w:rPr>
-          <w:rFonts w:ascii="Times New Roman" w:hAnsi="Times New Roman"/>
-          <w:sz w:val="20"/>
-        </w:rPr>
-        <w:t>transformer blocks with an embedding dimension of 192 and 3 attention heads per block. Input images are resized to 224×224 pixels and decomposed into 196 non-overlapping patches of 16×16 pixels each. Learnable position embeddings are added to provide spati</w:t>
-      </w:r>
-      <w:r>
-        <w:rPr>
-          <w:rFonts w:ascii="Times New Roman" w:hAnsi="Times New Roman"/>
-          <w:sz w:val="20"/>
-        </w:rPr>
-        <w:t>al context. The architecture parameters are summarized in Table I.</w:t>
+        <w:t>We adopt the ViT-Tiny configuration as our backbone encoder, consisting of 12 transformer blocks with an embedding dimension of 192 and 3 attention heads per block. Input images are resized to 224×224 pixels and decomposed into 196 non-overlapping patches of 16×16 pixels each. Learnable position embeddings are added to provide spatial context. The architecture parameters are summarized in Table I.</w:t>
       </w:r>
     </w:p>
     <w:tbl>
@@ -901,15 +775,7 @@
           <w:b/>
           <w:sz w:val="16"/>
         </w:rPr>
-        <w:t xml:space="preserve">TABLE I. </w:t>
-      </w:r>
-      <w:r>
-        <w:rPr>
-          <w:rFonts w:ascii="Times New Roman" w:hAnsi="Times New Roman"/>
-          <w:b/>
-          <w:sz w:val="16"/>
-        </w:rPr>
-        <w:t>ViT-Tiny Encoder Configuration</w:t>
+        <w:t>TABLE I. ViT-Tiny Encoder Configuration</w:t>
       </w:r>
     </w:p>
     <w:p>
@@ -936,77 +802,21 @@
           <w:rFonts w:ascii="Times New Roman" w:hAnsi="Times New Roman"/>
           <w:sz w:val="20"/>
         </w:rPr>
-        <w:t>The central innovation of LeJEPA is SIGReg, which replaces the EMA teacher with a mathematically principled loss function. Given a batch of N encoded embeddings Z ∈ ℝ</w:t>
+        <w:t>The central innovation of LeJEPA is SIGReg, which replaces the EMA teacher with a mathematically principled loss function. Given a batch of N encoded embeddings Z ∈ ℝᴺˣᴰ, SIGReg operates as follows: (1) Center and standardize Z per dimension; (2) Generate K random unit-norm projection vectors; (3) Project Z onto each direction, yielding K univariate distributions; (4) Sort each projected distribution and compare against the expected quantiles of a standard Gaussian via L2 distance. The total SIGReg loss is the mean quantile-matching error across all projections. This directly enforces that the embedding distribution matches an isotropic Gaussian — mathematically preventing collapse without any moving-average networks.</w:t>
       </w:r>
+    </w:p>
+    <w:p>
+      <w:pPr>
+        <w:spacing w:after="80"/>
+        <w:ind w:firstLine="357"/>
+        <w:jc w:val="both"/>
+      </w:pPr>
       <w:r>
         <w:rPr>
           <w:rFonts w:ascii="Times New Roman" w:hAnsi="Times New Roman"/>
           <w:sz w:val="20"/>
         </w:rPr>
-        <w:t>ᴺ</w:t>
-      </w:r>
-      <w:r>
-        <w:rPr>
-          <w:rFonts w:ascii="Times New Roman" w:hAnsi="Times New Roman"/>
-          <w:sz w:val="20"/>
-        </w:rPr>
-        <w:t>ˣ</w:t>
-      </w:r>
-      <w:r>
-        <w:rPr>
-          <w:rFonts w:ascii="Times New Roman" w:hAnsi="Times New Roman"/>
-          <w:sz w:val="20"/>
-        </w:rPr>
-        <w:t>ᴰ</w:t>
-      </w:r>
-      <w:r>
-        <w:rPr>
-          <w:rFonts w:ascii="Times New Roman" w:hAnsi="Times New Roman"/>
-          <w:sz w:val="20"/>
-        </w:rPr>
-        <w:t xml:space="preserve">, </w:t>
-      </w:r>
-      <w:r>
-        <w:rPr>
-          <w:rFonts w:ascii="Times New Roman" w:hAnsi="Times New Roman"/>
-          <w:sz w:val="20"/>
-        </w:rPr>
-        <w:t>SIGReg operates as follows: (1) Center and standardize Z per dimension; (2) Generate K random unit-norm projection vectors; (3) Project Z onto each direction, yielding K univariate distributions; (4) Sort each projected distribution and compare against the</w:t>
-      </w:r>
-      <w:r>
-        <w:rPr>
-          <w:rFonts w:ascii="Times New Roman" w:hAnsi="Times New Roman"/>
-          <w:sz w:val="20"/>
-        </w:rPr>
-        <w:t xml:space="preserve"> expected quantiles of a standard Gaussian via L2 distance. The total SIGReg loss is the mean quantile-matching error across all projections. This directly enforces that the embedding distribution matches an isotropic Gaussian — mathematically preventing c</w:t>
-      </w:r>
-      <w:r>
-        <w:rPr>
-          <w:rFonts w:ascii="Times New Roman" w:hAnsi="Times New Roman"/>
-          <w:sz w:val="20"/>
-        </w:rPr>
-        <w:t>ollapse without any moving-average networks.</w:t>
-      </w:r>
-    </w:p>
-    <w:p>
-      <w:pPr>
-        <w:spacing w:after="80"/>
-        <w:ind w:firstLine="357"/>
-        <w:jc w:val="both"/>
-      </w:pPr>
-      <w:r>
-        <w:rPr>
-          <w:rFonts w:ascii="Times New Roman" w:hAnsi="Times New Roman"/>
-          <w:sz w:val="20"/>
-        </w:rPr>
-        <w:t>Our implementation additionally incorporates two auxiliary regularizers: (a) a variance loss that penalizes per-dimension variance deviations from unity via a ReLU hinge, and (b) a covariance loss that drives of</w:t>
-      </w:r>
-      <w:r>
-        <w:rPr>
-          <w:rFonts w:ascii="Times New Roman" w:hAnsi="Times New Roman"/>
-          <w:sz w:val="20"/>
-        </w:rPr>
-        <w:t>f-diagonal covariance entries toward zero, promoting decorrelation across embedding dimensions.</w:t>
+        <w:t>Our implementation additionally incorporates two auxiliary regularizers: (a) a variance loss that penalizes per-dimension variance deviations from unity via a ReLU hinge, and (b) a covariance loss that drives off-diagonal covariance entries toward zero, promoting decorrelation across embedding dimensions.</w:t>
       </w:r>
     </w:p>
     <w:p>
@@ -1033,14 +843,7 @@
           <w:rFonts w:ascii="Times New Roman" w:hAnsi="Times New Roman"/>
           <w:sz w:val="20"/>
         </w:rPr>
-        <w:t>During pretraining, we employ a multi-block masking strategy where 4 contiguous rectangular blocks of patches are randomly selec</w:t>
-      </w:r>
-      <w:r>
-        <w:rPr>
-          <w:rFonts w:ascii="Times New Roman" w:hAnsi="Times New Roman"/>
-          <w:sz w:val="20"/>
-        </w:rPr>
-        <w:t xml:space="preserve">ted as prediction targets. The context encoder processes only the visible (unmasked) patches, </w:t>
+        <w:t xml:space="preserve">During pretraining, we employ a multi-block masking strategy where 4 contiguous rectangular blocks of patches are randomly selected as prediction targets. The context encoder processes only the visible (unmasked) patches, </w:t>
       </w:r>
       <w:r>
         <w:rPr>
@@ -1048,14 +851,7 @@
           <w:sz w:val="20"/>
         </w:rPr>
         <w:lastRenderedPageBreak/>
-        <w:t>while a lightweight 6-block predictor transformer attempts to reconstruct the embeddings of the masked regions. This encourages the encoder to build rich contextu</w:t>
-      </w:r>
-      <w:r>
-        <w:rPr>
-          <w:rFonts w:ascii="Times New Roman" w:hAnsi="Times New Roman"/>
-          <w:sz w:val="20"/>
-        </w:rPr>
-        <w:t>al representations that capture global currency layout semantics.</w:t>
+        <w:t>while a lightweight 6-block predictor transformer attempts to reconstruct the embeddings of the masked regions. This encourages the encoder to build rich contextual representations that capture global currency layout semantics.</w:t>
       </w:r>
     </w:p>
     <w:p>
@@ -1082,14 +878,7 @@
           <w:rFonts w:ascii="Times New Roman" w:hAnsi="Times New Roman"/>
           <w:sz w:val="20"/>
         </w:rPr>
-        <w:t xml:space="preserve">To provide interpretable feature-level analysis alongside the deep learning classification, we implement six specialized analyzers as summarized in Table </w:t>
-      </w:r>
-      <w:r>
-        <w:rPr>
-          <w:rFonts w:ascii="Times New Roman" w:hAnsi="Times New Roman"/>
-          <w:sz w:val="20"/>
-        </w:rPr>
-        <w:t>II.</w:t>
+        <w:t>To provide interpretable feature-level analysis alongside the deep learning classification, we implement six specialized analyzers as summarized in Table II.</w:t>
       </w:r>
     </w:p>
     <w:tbl>
@@ -1515,15 +1304,7 @@
           <w:i/>
           <w:sz w:val="16"/>
         </w:rPr>
-        <w:t xml:space="preserve">Fig. 4. Radar Chart Comparing Per-Feature Confidence Profiles </w:t>
-      </w:r>
-      <w:r>
-        <w:rPr>
-          <w:rFonts w:ascii="Times New Roman" w:hAnsi="Times New Roman"/>
-          <w:i/>
-          <w:sz w:val="16"/>
-        </w:rPr>
-        <w:t>Between Genuine and Counterfeit Notes</w:t>
+        <w:t>Fig. 4. Radar Chart Comparing Per-Feature Confidence Profiles Between Genuine and Counterfeit Notes</w:t>
       </w:r>
     </w:p>
     <w:p>
@@ -1550,21 +1331,7 @@
           <w:rFonts w:ascii="Times New Roman" w:hAnsi="Times New Roman"/>
           <w:sz w:val="20"/>
         </w:rPr>
-        <w:t>The final classification decision is produced by an ensemble mechanism that computes a weighted average of the LeJEPA classifier output and the six CV feature scores. The LeJEPA component receives 5</w:t>
-      </w:r>
-      <w:r>
-        <w:rPr>
-          <w:rFonts w:ascii="Times New Roman" w:hAnsi="Times New Roman"/>
-          <w:sz w:val="20"/>
-        </w:rPr>
-        <w:t>0% of the total weight, while each CV analyzer contributes proportionally based on its individual reliability score. A threshold of 0.5 on the ensemble score determines the final REAL/FAKE verdict. This hybrid approach ensures that the system remains funct</w:t>
-      </w:r>
-      <w:r>
-        <w:rPr>
-          <w:rFonts w:ascii="Times New Roman" w:hAnsi="Times New Roman"/>
-          <w:sz w:val="20"/>
-        </w:rPr>
-        <w:t>ional even when the deep learning model is unavailable, falling back to pure CV-based detection.</w:t>
+        <w:t>The final classification decision is produced by an ensemble mechanism that computes a weighted average of the LeJEPA classifier output and the six CV feature scores. The LeJEPA component receives 50% of the total weight, while each CV analyzer contributes proportionally based on its individual reliability score. A threshold of 0.5 on the ensemble score determines the final REAL/FAKE verdict. This hybrid approach ensures that the system remains functional even when the deep learning model is unavailable, falling back to pure CV-based detection.</w:t>
       </w:r>
     </w:p>
     <w:p>
@@ -1592,14 +1359,7 @@
           <w:rFonts w:ascii="Times New Roman" w:hAnsi="Times New Roman"/>
           <w:sz w:val="20"/>
         </w:rPr>
-        <w:t>The detection system is implemented as a full-stack web application comprising three tiers: a React.js frontend for image upload and re</w:t>
-      </w:r>
-      <w:r>
-        <w:rPr>
-          <w:rFonts w:ascii="Times New Roman" w:hAnsi="Times New Roman"/>
-          <w:sz w:val="20"/>
-        </w:rPr>
-        <w:t xml:space="preserve">sult visualization, a FastAPI </w:t>
+        <w:t xml:space="preserve">The detection system is implemented as a full-stack web application comprising three tiers: a React.js frontend for image upload and result visualization, a FastAPI </w:t>
       </w:r>
       <w:r>
         <w:rPr>
@@ -1673,15 +1433,7 @@
           <w:i/>
           <w:sz w:val="16"/>
         </w:rPr>
-        <w:t xml:space="preserve">Fig. 6. End-to-End Analysis Pipeline from </w:t>
-      </w:r>
-      <w:r>
-        <w:rPr>
-          <w:rFonts w:ascii="Times New Roman" w:hAnsi="Times New Roman"/>
-          <w:i/>
-          <w:sz w:val="16"/>
-        </w:rPr>
-        <w:t>Image Upload to Result Storage</w:t>
+        <w:t>Fig. 6. End-to-End Analysis Pipeline from Image Upload to Result Storage</w:t>
       </w:r>
     </w:p>
     <w:p>
@@ -2140,21 +1892,7 @@
           <w:rFonts w:ascii="Times New Roman" w:hAnsi="Times New Roman"/>
           <w:sz w:val="20"/>
         </w:rPr>
-        <w:t xml:space="preserve">We curate a dataset of 7,445 Indian currency images </w:t>
-      </w:r>
-      <w:r>
-        <w:rPr>
-          <w:rFonts w:ascii="Times New Roman" w:hAnsi="Times New Roman"/>
-          <w:sz w:val="20"/>
-        </w:rPr>
-        <w:t>spanning seven denominations (₹10, ₹20, ₹50, ₹100, ₹200, ₹500, and ₹2000) collected from publicly available sources. The dataset is organized in a binary classification structure with each denomination folder containing 'Real' and 'Fake' subdirectories. Im</w:t>
-      </w:r>
-      <w:r>
-        <w:rPr>
-          <w:rFonts w:ascii="Times New Roman" w:hAnsi="Times New Roman"/>
-          <w:sz w:val="20"/>
-        </w:rPr>
-        <w:t>ages are captured under varying lighting conditions, orientations, and resolution levels to simulate real-world deployment scenarios. The distribution is visualized in Fig. 7.</w:t>
+        <w:t>We curate a dataset of 7,445 Indian currency images spanning seven denominations (₹10, ₹20, ₹50, ₹100, ₹200, ₹500, and ₹2000) collected from publicly available sources. The dataset is organized in a binary classification structure with each denomination folder containing 'Real' and 'Fake' subdirectories. Images are captured under varying lighting conditions, orientations, and resolution levels to simulate real-world deployment scenarios. The distribution is visualized in Fig. 7.</w:t>
       </w:r>
     </w:p>
     <w:p>
@@ -2215,15 +1953,7 @@
           <w:i/>
           <w:sz w:val="16"/>
         </w:rPr>
-        <w:t>Fig. 7. Dataset Distribution Across Denominations Showing Genuine vs. Counterf</w:t>
-      </w:r>
-      <w:r>
-        <w:rPr>
-          <w:rFonts w:ascii="Times New Roman" w:hAnsi="Times New Roman"/>
-          <w:i/>
-          <w:sz w:val="16"/>
-        </w:rPr>
-        <w:t>eit Samples</w:t>
+        <w:t>Fig. 7. Dataset Distribution Across Denominations Showing Genuine vs. Counterfeit Samples</w:t>
       </w:r>
     </w:p>
     <w:p>
@@ -2258,14 +1988,7 @@
           <w:sz w:val="20"/>
         </w:rPr>
         <w:lastRenderedPageBreak/>
-        <w:t xml:space="preserve">feasibility of deployment in resource-constrained environments without GPU acceleration. The training configuration is </w:t>
-      </w:r>
-      <w:r>
-        <w:rPr>
-          <w:rFonts w:ascii="Times New Roman" w:hAnsi="Times New Roman"/>
-          <w:sz w:val="20"/>
-        </w:rPr>
-        <w:t>detailed in Table IV.</w:t>
+        <w:t>feasibility of deployment in resource-constrained environments without GPU acceleration. The training configuration is detailed in Table IV.</w:t>
       </w:r>
     </w:p>
     <w:tbl>
@@ -2668,14 +2391,7 @@
           <w:rFonts w:ascii="Times New Roman" w:hAnsi="Times New Roman"/>
           <w:sz w:val="20"/>
         </w:rPr>
-        <w:t>The trained LeJEPA classifier is evaluated against a held-out validation set of 1,116 images (approximately 15% of the total dataset). Due to computational constraints</w:t>
-      </w:r>
-      <w:r>
-        <w:rPr>
-          <w:rFonts w:ascii="Times New Roman" w:hAnsi="Times New Roman"/>
-          <w:sz w:val="20"/>
-        </w:rPr>
-        <w:t xml:space="preserve"> imposed by CPU-only training, we report baseline results from a single pretraining epoch to establish proof-of-concept, alongside projected 50-epoch estimates based on observed convergence trends. Results are presented in Table V.</w:t>
+        <w:t>The trained LeJEPA classifier is evaluated against a held-out validation set of 1,116 images (approximately 15% of the total dataset). Due to computational constraints imposed by CPU-only training, we report baseline results from a single pretraining epoch to establish proof-of-concept, alongside projected 50-epoch estimates based on observed convergence trends. Results are presented in Table V.</w:t>
       </w:r>
     </w:p>
     <w:tbl>
@@ -2741,16 +2457,7 @@
                 <w:color w:val="FFFFFF"/>
                 <w:sz w:val="16"/>
               </w:rPr>
-              <w:t xml:space="preserve">50-Epoch </w:t>
-            </w:r>
-            <w:r>
-              <w:rPr>
-                <w:rFonts w:ascii="Times New Roman" w:hAnsi="Times New Roman"/>
-                <w:b/>
-                <w:color w:val="FFFFFF"/>
-                <w:sz w:val="16"/>
-              </w:rPr>
-              <w:t>(Projected)</w:t>
+              <w:t>50-Epoch (Projected)</w:t>
             </w:r>
           </w:p>
         </w:tc>
@@ -3030,28 +2737,7 @@
           <w:rFonts w:ascii="Times New Roman" w:hAnsi="Times New Roman"/>
           <w:sz w:val="20"/>
         </w:rPr>
-        <w:t xml:space="preserve">The most notable </w:t>
-      </w:r>
-      <w:r>
-        <w:rPr>
-          <w:rFonts w:ascii="Times New Roman" w:hAnsi="Times New Roman"/>
-          <w:sz w:val="20"/>
-        </w:rPr>
-        <w:t>finding is the exceptionally high precision of 86.48% achieved after just a single epoch. This indicates that the SIGReg regularization successfully prevents the encoder from collapsing into trivial solutions, allowing meaningful feature separation to emer</w:t>
-      </w:r>
-      <w:r>
-        <w:rPr>
-          <w:rFonts w:ascii="Times New Roman" w:hAnsi="Times New Roman"/>
-          <w:sz w:val="20"/>
-        </w:rPr>
-        <w:t>ge rapidly. From a practical standpoint, high precision is the most critical metric in currency authentication: it ensures that when the system classifies a note as 'genuine,' the probability of that note actually being counterfeit is extremely low (only 4</w:t>
-      </w:r>
-      <w:r>
-        <w:rPr>
-          <w:rFonts w:ascii="Times New Roman" w:hAnsi="Times New Roman"/>
-          <w:sz w:val="20"/>
-        </w:rPr>
-        <w:t>.3% false acceptance rate).</w:t>
+        <w:t>The most notable finding is the exceptionally high precision of 86.48% achieved after just a single epoch. This indicates that the SIGReg regularization successfully prevents the encoder from collapsing into trivial solutions, allowing meaningful feature separation to emerge rapidly. From a practical standpoint, high precision is the most critical metric in currency authentication: it ensures that when the system classifies a note as 'genuine,' the probability of that note actually being counterfeit is extremely low (only 4.3% false acceptance rate).</w:t>
       </w:r>
     </w:p>
     <w:p>
@@ -3066,21 +2752,7 @@
           <w:sz w:val="20"/>
         </w:rPr>
         <w:lastRenderedPageBreak/>
-        <w:t>The comparatively low recall of 38.46% reflects the conservative classification behavior of the under-trained model, which defaults to predicting 'FAKE' when uncertain. As shown in the confusion matrix (Fig. 3), the model correc</w:t>
-      </w:r>
-      <w:r>
-        <w:rPr>
-          <w:rFonts w:ascii="Times New Roman" w:hAnsi="Times New Roman"/>
-          <w:sz w:val="20"/>
-        </w:rPr>
-        <w:t>tly identifies 358 of 401 counterfeit notes but misclassifies 440 of 715 genuine notes as counterfeit (false positives). This asymmetry is expected to resolve with extended training as the encoder develops richer representations of genuine currency feature</w:t>
-      </w:r>
-      <w:r>
-        <w:rPr>
-          <w:rFonts w:ascii="Times New Roman" w:hAnsi="Times New Roman"/>
-          <w:sz w:val="20"/>
-        </w:rPr>
-        <w:t>s.</w:t>
+        <w:t>The comparatively low recall of 38.46% reflects the conservative classification behavior of the under-trained model, which defaults to predicting 'FAKE' when uncertain. As shown in the confusion matrix (Fig. 3), the model correctly identifies 358 of 401 counterfeit notes but misclassifies 440 of 715 genuine notes as counterfeit (false positives). This asymmetry is expected to resolve with extended training as the encoder develops richer representations of genuine currency features.</w:t>
       </w:r>
     </w:p>
     <w:p>
@@ -3168,21 +2840,7 @@
           <w:rFonts w:ascii="Times New Roman" w:hAnsi="Times New Roman"/>
           <w:sz w:val="20"/>
         </w:rPr>
-        <w:t>Fig. 2 illustrates the pretraining loss convergence trajectory of LeJEPA compared to standard I-JEPA with EMA and a Masked Autoencoder (MAE) baselin</w:t>
-      </w:r>
-      <w:r>
-        <w:rPr>
-          <w:rFonts w:ascii="Times New Roman" w:hAnsi="Times New Roman"/>
-          <w:sz w:val="20"/>
-        </w:rPr>
-        <w:t>e. LeJEPA demonstrates significantly faster convergence, reaching sub-0.5 loss within 8 epochs compared to 22+ epochs for I-JEPA. This acceleration is attributed to SIGReg's direct mathematical enforcement of embedding structure, which eliminates the warm-</w:t>
-      </w:r>
-      <w:r>
-        <w:rPr>
-          <w:rFonts w:ascii="Times New Roman" w:hAnsi="Times New Roman"/>
-          <w:sz w:val="20"/>
-        </w:rPr>
-        <w:t>up instability inherent in EMA-based methods where the teacher network initially provides noisy supervisory signals.</w:t>
+        <w:t>Fig. 2 illustrates the pretraining loss convergence trajectory of LeJEPA compared to standard I-JEPA with EMA and a Masked Autoencoder (MAE) baseline. LeJEPA demonstrates significantly faster convergence, reaching sub-0.5 loss within 8 epochs compared to 22+ epochs for I-JEPA. This acceleration is attributed to SIGReg's direct mathematical enforcement of embedding structure, which eliminates the warm-up instability inherent in EMA-based methods where the teacher network initially provides noisy supervisory signals.</w:t>
       </w:r>
     </w:p>
     <w:p>
@@ -3270,8 +2928,6 @@
       <w:pPr>
         <w:spacing w:before="120" w:after="40"/>
       </w:pPr>
-      <w:bookmarkStart w:id="0" w:name="_GoBack"/>
-      <w:bookmarkEnd w:id="0"/>
       <w:r>
         <w:rPr>
           <w:rFonts w:ascii="Times New Roman" w:hAnsi="Times New Roman"/>
@@ -3689,15 +3345,7 @@
           <w:b/>
           <w:sz w:val="16"/>
         </w:rPr>
-        <w:t xml:space="preserve">TABLE VI. Comparison </w:t>
-      </w:r>
-      <w:r>
-        <w:rPr>
-          <w:rFonts w:ascii="Times New Roman" w:hAnsi="Times New Roman"/>
-          <w:b/>
-          <w:sz w:val="16"/>
-        </w:rPr>
-        <w:t>with Prior Work (* = precision-weighted)</w:t>
+        <w:t>TABLE VI. Comparison with Prior Work (* = precision-weighted)</w:t>
       </w:r>
     </w:p>
     <w:p>
@@ -3711,14 +3359,7 @@
           <w:rFonts w:ascii="Times New Roman" w:hAnsi="Times New Roman"/>
           <w:sz w:val="20"/>
         </w:rPr>
-        <w:t>As shown in Table VI, our LeJEPA-based system achieves competitive performance against fully supervised methods while requiring zero manual annotation during pretraining and operating entirely on CPU hardware. The o</w:t>
-      </w:r>
-      <w:r>
-        <w:rPr>
-          <w:rFonts w:ascii="Times New Roman" w:hAnsi="Times New Roman"/>
-          <w:sz w:val="20"/>
-        </w:rPr>
-        <w:t>nly methods that surpass our accuracy require either GPU training (ResNet-50, VGG-16) or controlled imaging environments (SIFT). Our system operates on uncontrolled, naturally captured images with no hardware constraints.</w:t>
+        <w:t>As shown in Table VI, our LeJEPA-based system achieves competitive performance against fully supervised methods while requiring zero manual annotation during pretraining and operating entirely on CPU hardware. The only methods that surpass our accuracy require either GPU training (ResNet-50, VGG-16) or controlled imaging environments (SIFT). Our system operates on uncontrolled, naturally captured images with no hardware constraints.</w:t>
       </w:r>
     </w:p>
     <w:p>
@@ -3746,56 +3387,21 @@
           <w:rFonts w:ascii="Times New Roman" w:hAnsi="Times New Roman"/>
           <w:sz w:val="20"/>
         </w:rPr>
-        <w:t>Th</w:t>
+        <w:t>This paper presents the first application of LeJEPA, a heuristic-free Joint-Embedding Predictive Architecture, to the problem of Indian currency authentication. By replacing fragile EMA-based teacher networks with mathematically principled SIGReg regularization, our system achieves rapid convergence and strong precision (86.48%) even under extreme resource constraints (single-epoch, CPU-only training). The hybrid architecture combining deep SSL representations with interpretable CV features provides both high accuracy and explainable decision rationale — a critical requirement for financial security applications.</w:t>
       </w:r>
+    </w:p>
+    <w:p>
+      <w:pPr>
+        <w:spacing w:after="80"/>
+        <w:ind w:firstLine="357"/>
+        <w:jc w:val="both"/>
+      </w:pPr>
       <w:r>
         <w:rPr>
           <w:rFonts w:ascii="Times New Roman" w:hAnsi="Times New Roman"/>
           <w:sz w:val="20"/>
         </w:rPr>
-        <w:t>is paper presents the first application of LeJEPA, a heuristic-free Joint-Embedding Predictive Architecture, to the problem of Indian currency authentication. By replacing fragile EMA-based teacher networks with mathematically principled SIGReg regularizat</w:t>
-      </w:r>
-      <w:r>
-        <w:rPr>
-          <w:rFonts w:ascii="Times New Roman" w:hAnsi="Times New Roman"/>
-          <w:sz w:val="20"/>
-        </w:rPr>
-        <w:t>ion, our system achieves rapid convergence and strong precision (86.48%) even under extreme resource constraints (single-epoch, CPU-only training). The hybrid architecture combining deep SSL representations with interpretable CV features provides both high</w:t>
-      </w:r>
-      <w:r>
-        <w:rPr>
-          <w:rFonts w:ascii="Times New Roman" w:hAnsi="Times New Roman"/>
-          <w:sz w:val="20"/>
-        </w:rPr>
-        <w:t xml:space="preserve"> accuracy and explainable decision rationale — a critical requirement for financial security applications.</w:t>
-      </w:r>
-    </w:p>
-    <w:p>
-      <w:pPr>
-        <w:spacing w:after="80"/>
-        <w:ind w:firstLine="357"/>
-        <w:jc w:val="both"/>
-      </w:pPr>
-      <w:r>
-        <w:rPr>
-          <w:rFonts w:ascii="Times New Roman" w:hAnsi="Times New Roman"/>
-          <w:sz w:val="20"/>
-        </w:rPr>
-        <w:t>Future work will focus on: (1) scaling pretraining to 50+ epochs with GPU acceleration to maximize recall; (2) extending to video-based detection usi</w:t>
-      </w:r>
-      <w:r>
-        <w:rPr>
-          <w:rFonts w:ascii="Times New Roman" w:hAnsi="Times New Roman"/>
-          <w:sz w:val="20"/>
-        </w:rPr>
-        <w:t>ng temporal JEPA variants for ATM feed analysis; (3) incorporating attention visualization to highlight suspicious regions on currency images; and (4) deploying the system as a mobile application for real-time field verification by bank personnel and merch</w:t>
-      </w:r>
-      <w:r>
-        <w:rPr>
-          <w:rFonts w:ascii="Times New Roman" w:hAnsi="Times New Roman"/>
-          <w:sz w:val="20"/>
-        </w:rPr>
-        <w:t>ants.</w:t>
+        <w:t>Future work will focus on: (1) scaling pretraining to 50+ epochs with GPU acceleration to maximize recall; (2) extending to video-based detection using temporal JEPA variants for ATM feed analysis; (3) incorporating attention visualization to highlight suspicious regions on currency images; and (4) deploying the system as a mobile application for real-time field verification by bank personnel and merchants.</w:t>
       </w:r>
     </w:p>
     <w:p>
@@ -3848,34 +3454,20 @@
           <w:rFonts w:ascii="Times New Roman" w:hAnsi="Times New Roman"/>
           <w:sz w:val="16"/>
         </w:rPr>
-        <w:t>[3] R. Balestriero</w:t>
+        <w:t>[3] R. Balestriero and Y. LeCun, "LeJEPA: Provable and Scalable Online Joint-Embedding Learning without the Heuristics," arXiv:2511.08544, 2025.</w:t>
       </w:r>
+    </w:p>
+    <w:p>
+      <w:pPr>
+        <w:spacing w:after="40"/>
+        <w:jc w:val="both"/>
+      </w:pPr>
       <w:r>
         <w:rPr>
           <w:rFonts w:ascii="Times New Roman" w:hAnsi="Times New Roman"/>
           <w:sz w:val="16"/>
         </w:rPr>
-        <w:t xml:space="preserve"> and Y. LeCun, "LeJEPA: Provable and Scalable Online Joint-Embedding Learning without the Heuristics," arXiv:2511.08544, 2025.</w:t>
-      </w:r>
-    </w:p>
-    <w:p>
-      <w:pPr>
-        <w:spacing w:after="40"/>
-        <w:jc w:val="both"/>
-      </w:pPr>
-      <w:r>
-        <w:rPr>
-          <w:rFonts w:ascii="Times New Roman" w:hAnsi="Times New Roman"/>
-          <w:sz w:val="16"/>
-        </w:rPr>
-        <w:t>[4] A. Kumar, R. Sharma, and P. Singh, "Multi-Stage Counterfeit Currency Detection Using UV and GLCM Features," IEEE ICIP, pp. 23</w:t>
-      </w:r>
-      <w:r>
-        <w:rPr>
-          <w:rFonts w:ascii="Times New Roman" w:hAnsi="Times New Roman"/>
-          <w:sz w:val="16"/>
-        </w:rPr>
-        <w:t>41-2345, 2021.</w:t>
+        <w:t>[4] A. Kumar, R. Sharma, and P. Singh, "Multi-Stage Counterfeit Currency Detection Using UV and GLCM Features," IEEE ICIP, pp. 2341-2345, 2021.</w:t>
       </w:r>
     </w:p>
     <w:p>
@@ -3902,14 +3494,7 @@
           <w:sz w:val="16"/>
         </w:rPr>
         <w:lastRenderedPageBreak/>
-        <w:t>[6] S. Sarkar, D. Mukherjee, and A. Das, "Deep Transfer Learning for Counterfeit Currency Reco</w:t>
-      </w:r>
-      <w:r>
-        <w:rPr>
-          <w:rFonts w:ascii="Times New Roman" w:hAnsi="Times New Roman"/>
-          <w:sz w:val="16"/>
-        </w:rPr>
-        <w:t>gnition," Pattern Recognition Letters, vol. 148, pp. 120-127, 2023.</w:t>
+        <w:t>[6] S. Sarkar, D. Mukherjee, and A. Das, "Deep Transfer Learning for Counterfeit Currency Recognition," Pattern Recognition Letters, vol. 148, pp. 120-127, 2023.</w:t>
       </w:r>
     </w:p>
     <w:p>
@@ -3935,14 +3520,7 @@
           <w:rFonts w:ascii="Times New Roman" w:hAnsi="Times New Roman"/>
           <w:sz w:val="16"/>
         </w:rPr>
-        <w:t>[8] K. He, X. Chen, S. Xie, Y. Li, P. Dollár, and R.</w:t>
-      </w:r>
-      <w:r>
-        <w:rPr>
-          <w:rFonts w:ascii="Times New Roman" w:hAnsi="Times New Roman"/>
-          <w:sz w:val="16"/>
-        </w:rPr>
-        <w:t xml:space="preserve"> Girshick, "Masked Autoencoders Are Scalable Vision Learners," IEEE CVPR, pp. 16000-16009, 2022.</w:t>
+        <w:t>[8] K. He, X. Chen, S. Xie, Y. Li, P. Dollár, and R. Girshick, "Masked Autoencoders Are Scalable Vision Learners," IEEE CVPR, pp. 16000-16009, 2022.</w:t>
       </w:r>
     </w:p>
     <w:p>
@@ -3968,14 +3546,7 @@
           <w:rFonts w:ascii="Times New Roman" w:hAnsi="Times New Roman"/>
           <w:sz w:val="16"/>
         </w:rPr>
-        <w:t xml:space="preserve">[10] M. Assran et al., "Self-Supervised </w:t>
-      </w:r>
-      <w:r>
-        <w:rPr>
-          <w:rFonts w:ascii="Times New Roman" w:hAnsi="Times New Roman"/>
-          <w:sz w:val="16"/>
-        </w:rPr>
-        <w:t>Learning from Images with a Joint-Embedding Predictive Architecture," IEEE CVPR, pp. 15619-15629, 2023.</w:t>
+        <w:t>[10] M. Assran et al., "Self-Supervised Learning from Images with a Joint-Embedding Predictive Architecture," IEEE CVPR, pp. 15619-15629, 2023.</w:t>
       </w:r>
     </w:p>
     <w:sectPr>
@@ -15895,7 +15466,7 @@
 </file>
 
 <file path=customXml/itemProps1.xml><?xml version="1.0" encoding="utf-8"?>
-<ds:datastoreItem xmlns:ds="http://schemas.openxmlformats.org/officeDocument/2006/customXml" ds:itemID="{E031E845-625E-4F28-8B5E-A4DC49CCB202}">
+<ds:datastoreItem xmlns:ds="http://schemas.openxmlformats.org/officeDocument/2006/customXml" ds:itemID="{4B135CDC-2C5F-4EB3-94BC-22B9C1ECCC56}">
   <ds:schemaRefs>
     <ds:schemaRef ds:uri="http://schemas.openxmlformats.org/officeDocument/2006/bibliography"/>
   </ds:schemaRefs>

</xml_diff>